<commit_message>
Fixed Error with old Resume
</commit_message>
<xml_diff>
--- a/public/MasonFancherCV.docx
+++ b/public/MasonFancherCV.docx
@@ -4,22 +4,12 @@
   <w:body>
     <w:tbl>
       <w:tblPr>
-        <w:tblStyle w:val="TableNormal"/>
         <w:tblW w:w="9026" w:type="dxa"/>
-        <w:tblBorders>
-          <w:top w:val="none" w:sz="0" w:space="0" w:color="auto"/>
-          <w:left w:val="none" w:sz="0" w:space="0" w:color="auto"/>
-          <w:bottom w:val="none" w:sz="0" w:space="0" w:color="auto"/>
-          <w:right w:val="none" w:sz="0" w:space="0" w:color="auto"/>
-          <w:insideH w:val="none" w:sz="0" w:space="0" w:color="auto"/>
-          <w:insideV w:val="none" w:sz="0" w:space="0" w:color="auto"/>
-        </w:tblBorders>
         <w:tblCellMar>
-          <w:top w:w="0" w:type="dxa"/>
           <w:left w:w="0" w:type="dxa"/>
-          <w:bottom w:w="0" w:type="dxa"/>
           <w:right w:w="0" w:type="dxa"/>
         </w:tblCellMar>
+        <w:tblLook w:val="04A0" w:firstRow="1" w:lastRow="0" w:firstColumn="1" w:lastColumn="0" w:noHBand="0" w:noVBand="1"/>
       </w:tblPr>
       <w:tblGrid>
         <w:gridCol w:w="4200"/>
@@ -32,9 +22,6 @@
             <w:vAlign w:val="center"/>
           </w:tcPr>
           <w:p>
-            <w:pPr>
-              <w:spacing w:before="0" w:after="0"/>
-            </w:pPr>
             <w:r>
               <w:rPr>
                 <w:rFonts w:ascii="Georgia" w:eastAsia="Georgia" w:hAnsi="Georgia" w:cs="Georgia"/>
@@ -50,7 +37,7 @@
           </w:p>
           <w:p>
             <w:pPr>
-              <w:spacing w:before="40" w:after="0"/>
+              <w:spacing w:before="40"/>
             </w:pPr>
             <w:r>
               <w:rPr>
@@ -71,12 +58,11 @@
           </w:tcPr>
           <w:p>
             <w:pPr>
+              <w:spacing w:after="20"/>
               <w:jc w:val="right"/>
-              <w:spacing w:before="0" w:after="20"/>
             </w:pPr>
             <w:r>
               <w:rPr>
-                <w:color w:val="444444"/>
                 <w:sz w:val="18"/>
                 <w:szCs w:val="18"/>
               </w:rPr>
@@ -86,7 +72,6 @@
           <w:p>
             <w:pPr>
               <w:jc w:val="right"/>
-              <w:spacing w:before="0" w:after="0"/>
             </w:pPr>
             <w:hyperlink r:id="rId5" w:history="1">
               <w:r>
@@ -101,13 +86,12 @@
             </w:hyperlink>
             <w:r>
               <w:rPr>
-                <w:color w:val="444444"/>
                 <w:sz w:val="18"/>
                 <w:szCs w:val="18"/>
               </w:rPr>
               <w:t xml:space="preserve">  |  </w:t>
             </w:r>
-            <w:hyperlink r:id="rId12" w:history="1">
+            <w:hyperlink r:id="rId6" w:history="1">
               <w:r>
                 <w:rPr>
                   <w:color w:val="2563EB"/>
@@ -120,13 +104,12 @@
             </w:hyperlink>
             <w:r>
               <w:rPr>
-                <w:color w:val="444444"/>
                 <w:sz w:val="18"/>
                 <w:szCs w:val="18"/>
               </w:rPr>
               <w:t xml:space="preserve">  |  </w:t>
             </w:r>
-            <w:hyperlink r:id="rId6" w:history="1">
+            <w:hyperlink r:id="rId7" w:history="1">
               <w:r>
                 <w:rPr>
                   <w:color w:val="2563EB"/>
@@ -547,7 +530,7 @@
       <w:r>
         <w:t xml:space="preserve">Pokémon TCG card tracker with real-time Firestore sync, search and filter functionality, and a personal collection management system. Built to track and manage a growing card collection. </w:t>
       </w:r>
-      <w:hyperlink r:id="rId7" w:history="1">
+      <w:hyperlink r:id="rId8" w:history="1">
         <w:r>
           <w:rPr>
             <w:rStyle w:val="Hyperlink"/>
@@ -588,7 +571,7 @@
       <w:r>
         <w:t xml:space="preserve">Fully responsive freelance client site featuring a Cloudinary-powered photo gallery, AOS-animated UI, integrated third-party booking system, and a working contact form via EmailJS. Deployed to Netlify.  </w:t>
       </w:r>
-      <w:hyperlink r:id="rId8" w:history="1">
+      <w:hyperlink r:id="rId9" w:history="1">
         <w:r>
           <w:rPr>
             <w:rStyle w:val="Hyperlink"/>
@@ -629,7 +612,7 @@
       <w:r>
         <w:t xml:space="preserve">Internal operations application for an international school— real-time student sign-in, staff clock-in with 15th-to-15th pay period tracking, and bus/driver coordination.  </w:t>
       </w:r>
-      <w:hyperlink r:id="rId9" w:history="1">
+      <w:hyperlink r:id="rId10" w:history="1">
         <w:r>
           <w:rPr>
             <w:rStyle w:val="Hyperlink"/>
@@ -800,7 +783,7 @@
         <w:t>Indiana State University</w:t>
       </w:r>
       <w:r>
-        <w:tab/>
+        <w:t xml:space="preserve"> </w:t>
       </w:r>
       <w:r>
         <w:rPr>

</xml_diff>